<commit_message>
Update Extended Abstract Word template with latest version
Replaces downloads/QIRTAsia2027_ExtendedAbstract_Template.docx with
the updated version. Filename is unchanged, so the existing download
link on the Submission page picks it up automatically.
</commit_message>
<xml_diff>
--- a/downloads/QIRTAsia2027_ExtendedAbstract_Template.docx
+++ b/downloads/QIRTAsia2027_ExtendedAbstract_Template.docx
@@ -1,6 +1,6 @@
 
 <file path=word/document.xml><?xml version="1.0" encoding="utf-8"?>
-<w:document xmlns:wpc="http://schemas.microsoft.com/office/word/2010/wordprocessingCanvas" xmlns:cx="http://schemas.microsoft.com/office/drawing/2014/chartex" xmlns:cx1="http://schemas.microsoft.com/office/drawing/2015/9/8/chartex" xmlns:cx2="http://schemas.microsoft.com/office/drawing/2015/10/21/chartex" xmlns:cx3="http://schemas.microsoft.com/office/drawing/2016/5/9/chartex" xmlns:cx4="http://schemas.microsoft.com/office/drawing/2016/5/10/chartex" xmlns:cx5="http://schemas.microsoft.com/office/drawing/2016/5/11/chartex" xmlns:cx6="http://schemas.microsoft.com/office/drawing/2016/5/12/chartex" xmlns:cx7="http://schemas.microsoft.com/office/drawing/2016/5/13/chartex" xmlns:cx8="http://schemas.microsoft.com/office/drawing/2016/5/14/chartex" xmlns:mc="http://schemas.openxmlformats.org/markup-compatibility/2006" xmlns:aink="http://schemas.microsoft.com/office/drawing/2016/ink" xmlns:am3d="http://schemas.microsoft.com/office/drawing/2017/model3d" xmlns:o="urn:schemas-microsoft-com:office:office" xmlns:oel="http://schemas.microsoft.com/office/2019/extlst" xmlns:r="http://schemas.openxmlformats.org/officeDocument/2006/relationships" xmlns:m="http://schemas.openxmlformats.org/officeDocument/2006/math" xmlns:v="urn:schemas-microsoft-com:vml" xmlns:wp14="http://schemas.microsoft.com/office/word/2010/wordprocessingDrawing" xmlns:wp="http://schemas.openxmlformats.org/drawingml/2006/wordprocessingDrawing" xmlns:w10="urn:schemas-microsoft-com:office:word" xmlns:w="http://schemas.openxmlformats.org/wordprocessingml/2006/main" xmlns:w14="http://schemas.microsoft.com/office/word/2010/wordml" xmlns:w15="http://schemas.microsoft.com/office/word/2012/wordml" xmlns:w16cex="http://schemas.microsoft.com/office/word/2018/wordml/cex" xmlns:w16cid="http://schemas.microsoft.com/office/word/2016/wordml/cid" xmlns:w16="http://schemas.microsoft.com/office/word/2018/wordml" xmlns:w16du="http://schemas.microsoft.com/office/word/2023/wordml/word16du" xmlns:w16sdtdh="http://schemas.microsoft.com/office/word/2020/wordml/sdtdatahash" xmlns:w16sdtfl="http://schemas.microsoft.com/office/word/2024/wordml/sdtformatlock" xmlns:w16se="http://schemas.microsoft.com/office/word/2015/wordml/symex" xmlns:wpg="http://schemas.microsoft.com/office/word/2010/wordprocessingGroup" xmlns:wpi="http://schemas.microsoft.com/office/word/2010/wordprocessingInk" xmlns:wne="http://schemas.microsoft.com/office/word/2006/wordml" xmlns:wps="http://schemas.microsoft.com/office/word/2010/wordprocessingShape" mc:Ignorable="w14 w15 w16se w16cid w16 w16cex w16sdtdh w16sdtfl w16du wp14">
+<w:document xmlns:wpc="http://schemas.microsoft.com/office/word/2010/wordprocessingCanvas" xmlns:cx="http://schemas.microsoft.com/office/drawing/2014/chartex" xmlns:cx1="http://schemas.microsoft.com/office/drawing/2015/9/8/chartex" xmlns:cx2="http://schemas.microsoft.com/office/drawing/2015/10/21/chartex" xmlns:cx3="http://schemas.microsoft.com/office/drawing/2016/5/9/chartex" xmlns:cx4="http://schemas.microsoft.com/office/drawing/2016/5/10/chartex" xmlns:cx5="http://schemas.microsoft.com/office/drawing/2016/5/11/chartex" xmlns:cx6="http://schemas.microsoft.com/office/drawing/2016/5/12/chartex" xmlns:cx7="http://schemas.microsoft.com/office/drawing/2016/5/13/chartex" xmlns:cx8="http://schemas.microsoft.com/office/drawing/2016/5/14/chartex" xmlns:mc="http://schemas.openxmlformats.org/markup-compatibility/2006" xmlns:aink="http://schemas.microsoft.com/office/drawing/2016/ink" xmlns:am3d="http://schemas.microsoft.com/office/drawing/2017/model3d" xmlns:o="urn:schemas-microsoft-com:office:office" xmlns:oel="http://schemas.microsoft.com/office/2019/extlst" xmlns:r="http://schemas.openxmlformats.org/officeDocument/2006/relationships" xmlns:m="http://schemas.openxmlformats.org/officeDocument/2006/math" xmlns:v="urn:schemas-microsoft-com:vml" xmlns:wp14="http://schemas.microsoft.com/office/word/2010/wordprocessingDrawing" xmlns:wp="http://schemas.openxmlformats.org/drawingml/2006/wordprocessingDrawing" xmlns:w10="urn:schemas-microsoft-com:office:word" xmlns:w="http://schemas.openxmlformats.org/wordprocessingml/2006/main" xmlns:w14="http://schemas.microsoft.com/office/word/2010/wordml" xmlns:w15="http://schemas.microsoft.com/office/word/2012/wordml" xmlns:w16cei="http://schemas.microsoft.com/office/word/2026/wordml/cei" xmlns:w16cex="http://schemas.microsoft.com/office/word/2018/wordml/cex" xmlns:w16cid="http://schemas.microsoft.com/office/word/2016/wordml/cid" xmlns:w16="http://schemas.microsoft.com/office/word/2018/wordml" xmlns:w16du="http://schemas.microsoft.com/office/word/2023/wordml/word16du" xmlns:w16sdtdh="http://schemas.microsoft.com/office/word/2020/wordml/sdtdatahash" xmlns:w16sdtfl="http://schemas.microsoft.com/office/word/2024/wordml/sdtformatlock" xmlns:w16se="http://schemas.microsoft.com/office/word/2015/wordml/symex" xmlns:wpg="http://schemas.microsoft.com/office/word/2010/wordprocessingGroup" xmlns:wpi="http://schemas.microsoft.com/office/word/2010/wordprocessingInk" xmlns:wne="http://schemas.microsoft.com/office/word/2006/wordml" xmlns:wps="http://schemas.microsoft.com/office/word/2010/wordprocessingShape" mc:Ignorable="w14 w15 w16se w16cid w16 w16cex w16sdtdh w16sdtfl w16du wp14">
   <w:body>
     <w:p>
       <w:pPr>
@@ -198,31 +198,7 @@
         <w:rPr>
           <w:lang w:val="en-SG"/>
         </w:rPr>
-        <w:t xml:space="preserve">, justified). </w:t>
-      </w:r>
-      <w:r>
-        <w:rPr>
-          <w:lang w:val="en-SG"/>
-        </w:rPr>
-        <w:t>This is what the abstract text looks like</w:t>
-      </w:r>
-      <w:r>
-        <w:rPr>
-          <w:lang w:val="en-SG"/>
-        </w:rPr>
-        <w:t xml:space="preserve">. </w:t>
-      </w:r>
-      <w:r>
-        <w:rPr>
-          <w:lang w:val="en-SG"/>
-        </w:rPr>
-        <w:t>This is what the abstract text looks like</w:t>
-      </w:r>
-      <w:r>
-        <w:rPr>
-          <w:lang w:val="en-SG"/>
-        </w:rPr>
-        <w:t>.</w:t>
+        <w:t>, justified). This is what the abstract text looks like. This is what the abstract text looks like.</w:t>
       </w:r>
     </w:p>
     <w:p>
@@ -347,10 +323,10 @@
           <w:noProof/>
         </w:rPr>
         <w:object w:dxaOrig="177" w:dyaOrig="340" w14:anchorId="7BC7C768">
-          <v:shape id="ole_rId2" o:spid="_x0000_i1025" type="#_x0000_t75" alt="" style="width:8.45pt;height:16.95pt;visibility:visible;mso-width-percent:0;mso-height-percent:0;mso-wrap-distance-right:0;mso-width-percent:0;mso-height-percent:0" o:ole="" filled="t">
+          <v:shape id="ole_rId2" o:spid="_x0000_i1025" type="#_x0000_t75" alt="" style="width:8.15pt;height:16.9pt;visibility:visible;mso-width-percent:0;mso-height-percent:0;mso-wrap-distance-right:0;mso-width-percent:0;mso-height-percent:0" o:ole="" filled="t">
             <v:imagedata r:id="rId8" o:title=""/>
           </v:shape>
-          <o:OLEObject Type="Embed" ProgID="Equation.3" ShapeID="ole_rId2" DrawAspect="Content" ObjectID="_1827927807" r:id="rId9"/>
+          <o:OLEObject Type="Embed" ProgID="Equation.3" ShapeID="ole_rId2" DrawAspect="Content" ObjectID="_1847253747" r:id="rId9"/>
         </w:object>
       </w:r>
       <w:r>
@@ -365,10 +341,10 @@
           <w:noProof/>
         </w:rPr>
         <w:object w:dxaOrig="1535" w:dyaOrig="543" w14:anchorId="523785A6">
-          <v:shape id="ole_rId4" o:spid="_x0000_i1026" type="#_x0000_t75" alt="" style="width:76.25pt;height:25.4pt;visibility:visible;mso-width-percent:0;mso-height-percent:0;mso-wrap-distance-right:0;mso-width-percent:0;mso-height-percent:0" o:ole="" filled="t">
+          <v:shape id="ole_rId4" o:spid="_x0000_i1026" type="#_x0000_t75" alt="" style="width:76.4pt;height:25.65pt;visibility:visible;mso-width-percent:0;mso-height-percent:0;mso-wrap-distance-right:0;mso-width-percent:0;mso-height-percent:0" o:ole="" filled="t">
             <v:imagedata r:id="rId10" o:title=""/>
           </v:shape>
-          <o:OLEObject Type="Embed" ProgID="Equation.3" ShapeID="ole_rId4" DrawAspect="Content" ObjectID="_1827927808" r:id="rId11"/>
+          <o:OLEObject Type="Embed" ProgID="Equation.3" ShapeID="ole_rId4" DrawAspect="Content" ObjectID="_1847253748" r:id="rId11"/>
         </w:object>
       </w:r>
       <w:r>
@@ -440,23 +416,7 @@
       </w:r>
       <w:proofErr w:type="spellEnd"/>
       <w:r>
-        <w:t xml:space="preserve"> sample. The 6-axis </w:t>
-      </w:r>
-      <w:proofErr w:type="spellStart"/>
-      <w:r>
-        <w:t>cobot</w:t>
-      </w:r>
-      <w:proofErr w:type="spellEnd"/>
-      <w:r>
-        <w:t xml:space="preserve"> used in the setup has a maximum payload capacity of 5 kg and was programmed to follow a predefined scan trajectory across the sample. The synchronized movement of the </w:t>
-      </w:r>
-      <w:proofErr w:type="spellStart"/>
-      <w:r>
-        <w:t>cobot</w:t>
-      </w:r>
-      <w:proofErr w:type="spellEnd"/>
-      <w:r>
-        <w:t xml:space="preserve"> ensured a uniform scanning velocity, while the thermal response of the sample was recorded in real time. This configuration enabled precise control of the excitation and data acquisition parameters, facilitating consistent crack detection during the scanning process.</w:t>
+        <w:t xml:space="preserve"> sample. The 6-axis cobot used in the setup has a maximum payload capacity of 5 kg and was programmed to follow a predefined scan trajectory across the sample. The synchronized movement of the cobot ensured a uniform scanning velocity, while the thermal response of the sample was recorded in real time. This configuration enabled precise control of the excitation and data acquisition parameters, facilitating consistent crack detection during the scanning process.</w:t>
       </w:r>
     </w:p>
     <w:p/>
@@ -1036,7 +996,7 @@
 </file>
 
 <file path=word/endnotes.xml><?xml version="1.0" encoding="utf-8"?>
-<w:endnotes xmlns:wpc="http://schemas.microsoft.com/office/word/2010/wordprocessingCanvas" xmlns:cx="http://schemas.microsoft.com/office/drawing/2014/chartex" xmlns:cx1="http://schemas.microsoft.com/office/drawing/2015/9/8/chartex" xmlns:cx2="http://schemas.microsoft.com/office/drawing/2015/10/21/chartex" xmlns:cx3="http://schemas.microsoft.com/office/drawing/2016/5/9/chartex" xmlns:cx4="http://schemas.microsoft.com/office/drawing/2016/5/10/chartex" xmlns:cx5="http://schemas.microsoft.com/office/drawing/2016/5/11/chartex" xmlns:cx6="http://schemas.microsoft.com/office/drawing/2016/5/12/chartex" xmlns:cx7="http://schemas.microsoft.com/office/drawing/2016/5/13/chartex" xmlns:cx8="http://schemas.microsoft.com/office/drawing/2016/5/14/chartex" xmlns:mc="http://schemas.openxmlformats.org/markup-compatibility/2006" xmlns:aink="http://schemas.microsoft.com/office/drawing/2016/ink" xmlns:am3d="http://schemas.microsoft.com/office/drawing/2017/model3d" xmlns:o="urn:schemas-microsoft-com:office:office" xmlns:oel="http://schemas.microsoft.com/office/2019/extlst" xmlns:r="http://schemas.openxmlformats.org/officeDocument/2006/relationships" xmlns:m="http://schemas.openxmlformats.org/officeDocument/2006/math" xmlns:v="urn:schemas-microsoft-com:vml" xmlns:wp14="http://schemas.microsoft.com/office/word/2010/wordprocessingDrawing" xmlns:wp="http://schemas.openxmlformats.org/drawingml/2006/wordprocessingDrawing" xmlns:w10="urn:schemas-microsoft-com:office:word" xmlns:w="http://schemas.openxmlformats.org/wordprocessingml/2006/main" xmlns:w14="http://schemas.microsoft.com/office/word/2010/wordml" xmlns:w15="http://schemas.microsoft.com/office/word/2012/wordml" xmlns:w16cex="http://schemas.microsoft.com/office/word/2018/wordml/cex" xmlns:w16cid="http://schemas.microsoft.com/office/word/2016/wordml/cid" xmlns:w16="http://schemas.microsoft.com/office/word/2018/wordml" xmlns:w16du="http://schemas.microsoft.com/office/word/2023/wordml/word16du" xmlns:w16sdtdh="http://schemas.microsoft.com/office/word/2020/wordml/sdtdatahash" xmlns:w16sdtfl="http://schemas.microsoft.com/office/word/2024/wordml/sdtformatlock" xmlns:w16se="http://schemas.microsoft.com/office/word/2015/wordml/symex" xmlns:wpg="http://schemas.microsoft.com/office/word/2010/wordprocessingGroup" xmlns:wpi="http://schemas.microsoft.com/office/word/2010/wordprocessingInk" xmlns:wne="http://schemas.microsoft.com/office/word/2006/wordml" xmlns:wps="http://schemas.microsoft.com/office/word/2010/wordprocessingShape" mc:Ignorable="w14 w15 w16se w16cid w16 w16cex w16sdtdh w16sdtfl w16du wp14">
+<w:endnotes xmlns:wpc="http://schemas.microsoft.com/office/word/2010/wordprocessingCanvas" xmlns:cx="http://schemas.microsoft.com/office/drawing/2014/chartex" xmlns:cx1="http://schemas.microsoft.com/office/drawing/2015/9/8/chartex" xmlns:cx2="http://schemas.microsoft.com/office/drawing/2015/10/21/chartex" xmlns:cx3="http://schemas.microsoft.com/office/drawing/2016/5/9/chartex" xmlns:cx4="http://schemas.microsoft.com/office/drawing/2016/5/10/chartex" xmlns:cx5="http://schemas.microsoft.com/office/drawing/2016/5/11/chartex" xmlns:cx6="http://schemas.microsoft.com/office/drawing/2016/5/12/chartex" xmlns:cx7="http://schemas.microsoft.com/office/drawing/2016/5/13/chartex" xmlns:cx8="http://schemas.microsoft.com/office/drawing/2016/5/14/chartex" xmlns:mc="http://schemas.openxmlformats.org/markup-compatibility/2006" xmlns:aink="http://schemas.microsoft.com/office/drawing/2016/ink" xmlns:am3d="http://schemas.microsoft.com/office/drawing/2017/model3d" xmlns:o="urn:schemas-microsoft-com:office:office" xmlns:oel="http://schemas.microsoft.com/office/2019/extlst" xmlns:r="http://schemas.openxmlformats.org/officeDocument/2006/relationships" xmlns:m="http://schemas.openxmlformats.org/officeDocument/2006/math" xmlns:v="urn:schemas-microsoft-com:vml" xmlns:wp14="http://schemas.microsoft.com/office/word/2010/wordprocessingDrawing" xmlns:wp="http://schemas.openxmlformats.org/drawingml/2006/wordprocessingDrawing" xmlns:w10="urn:schemas-microsoft-com:office:word" xmlns:w="http://schemas.openxmlformats.org/wordprocessingml/2006/main" xmlns:w14="http://schemas.microsoft.com/office/word/2010/wordml" xmlns:w15="http://schemas.microsoft.com/office/word/2012/wordml" xmlns:w16cei="http://schemas.microsoft.com/office/word/2026/wordml/cei" xmlns:w16cex="http://schemas.microsoft.com/office/word/2018/wordml/cex" xmlns:w16cid="http://schemas.microsoft.com/office/word/2016/wordml/cid" xmlns:w16="http://schemas.microsoft.com/office/word/2018/wordml" xmlns:w16du="http://schemas.microsoft.com/office/word/2023/wordml/word16du" xmlns:w16sdtdh="http://schemas.microsoft.com/office/word/2020/wordml/sdtdatahash" xmlns:w16sdtfl="http://schemas.microsoft.com/office/word/2024/wordml/sdtformatlock" xmlns:w16se="http://schemas.microsoft.com/office/word/2015/wordml/symex" xmlns:wpg="http://schemas.microsoft.com/office/word/2010/wordprocessingGroup" xmlns:wpi="http://schemas.microsoft.com/office/word/2010/wordprocessingInk" xmlns:wne="http://schemas.microsoft.com/office/word/2006/wordml" xmlns:wps="http://schemas.microsoft.com/office/word/2010/wordprocessingShape" mc:Ignorable="w14 w15 w16se w16cid w16 w16cex w16sdtdh w16sdtfl w16du wp14">
   <w:endnote w:type="separator" w:id="-1">
     <w:p>
       <w:r>
@@ -1055,7 +1015,7 @@
 </file>
 
 <file path=word/footer1.xml><?xml version="1.0" encoding="utf-8"?>
-<w:ftr xmlns:wpc="http://schemas.microsoft.com/office/word/2010/wordprocessingCanvas" xmlns:cx="http://schemas.microsoft.com/office/drawing/2014/chartex" xmlns:cx1="http://schemas.microsoft.com/office/drawing/2015/9/8/chartex" xmlns:cx2="http://schemas.microsoft.com/office/drawing/2015/10/21/chartex" xmlns:cx3="http://schemas.microsoft.com/office/drawing/2016/5/9/chartex" xmlns:cx4="http://schemas.microsoft.com/office/drawing/2016/5/10/chartex" xmlns:cx5="http://schemas.microsoft.com/office/drawing/2016/5/11/chartex" xmlns:cx6="http://schemas.microsoft.com/office/drawing/2016/5/12/chartex" xmlns:cx7="http://schemas.microsoft.com/office/drawing/2016/5/13/chartex" xmlns:cx8="http://schemas.microsoft.com/office/drawing/2016/5/14/chartex" xmlns:mc="http://schemas.openxmlformats.org/markup-compatibility/2006" xmlns:aink="http://schemas.microsoft.com/office/drawing/2016/ink" xmlns:am3d="http://schemas.microsoft.com/office/drawing/2017/model3d" xmlns:o="urn:schemas-microsoft-com:office:office" xmlns:oel="http://schemas.microsoft.com/office/2019/extlst" xmlns:r="http://schemas.openxmlformats.org/officeDocument/2006/relationships" xmlns:m="http://schemas.openxmlformats.org/officeDocument/2006/math" xmlns:v="urn:schemas-microsoft-com:vml" xmlns:wp14="http://schemas.microsoft.com/office/word/2010/wordprocessingDrawing" xmlns:wp="http://schemas.openxmlformats.org/drawingml/2006/wordprocessingDrawing" xmlns:w10="urn:schemas-microsoft-com:office:word" xmlns:w="http://schemas.openxmlformats.org/wordprocessingml/2006/main" xmlns:w14="http://schemas.microsoft.com/office/word/2010/wordml" xmlns:w15="http://schemas.microsoft.com/office/word/2012/wordml" xmlns:w16cex="http://schemas.microsoft.com/office/word/2018/wordml/cex" xmlns:w16cid="http://schemas.microsoft.com/office/word/2016/wordml/cid" xmlns:w16="http://schemas.microsoft.com/office/word/2018/wordml" xmlns:w16du="http://schemas.microsoft.com/office/word/2023/wordml/word16du" xmlns:w16sdtdh="http://schemas.microsoft.com/office/word/2020/wordml/sdtdatahash" xmlns:w16sdtfl="http://schemas.microsoft.com/office/word/2024/wordml/sdtformatlock" xmlns:w16se="http://schemas.microsoft.com/office/word/2015/wordml/symex" xmlns:wpg="http://schemas.microsoft.com/office/word/2010/wordprocessingGroup" xmlns:wpi="http://schemas.microsoft.com/office/word/2010/wordprocessingInk" xmlns:wne="http://schemas.microsoft.com/office/word/2006/wordml" xmlns:wps="http://schemas.microsoft.com/office/word/2010/wordprocessingShape" mc:Ignorable="w14 w15 w16se w16cid w16 w16cex w16sdtdh w16sdtfl w16du wp14">
+<w:ftr xmlns:wpc="http://schemas.microsoft.com/office/word/2010/wordprocessingCanvas" xmlns:cx="http://schemas.microsoft.com/office/drawing/2014/chartex" xmlns:cx1="http://schemas.microsoft.com/office/drawing/2015/9/8/chartex" xmlns:cx2="http://schemas.microsoft.com/office/drawing/2015/10/21/chartex" xmlns:cx3="http://schemas.microsoft.com/office/drawing/2016/5/9/chartex" xmlns:cx4="http://schemas.microsoft.com/office/drawing/2016/5/10/chartex" xmlns:cx5="http://schemas.microsoft.com/office/drawing/2016/5/11/chartex" xmlns:cx6="http://schemas.microsoft.com/office/drawing/2016/5/12/chartex" xmlns:cx7="http://schemas.microsoft.com/office/drawing/2016/5/13/chartex" xmlns:cx8="http://schemas.microsoft.com/office/drawing/2016/5/14/chartex" xmlns:mc="http://schemas.openxmlformats.org/markup-compatibility/2006" xmlns:aink="http://schemas.microsoft.com/office/drawing/2016/ink" xmlns:am3d="http://schemas.microsoft.com/office/drawing/2017/model3d" xmlns:o="urn:schemas-microsoft-com:office:office" xmlns:oel="http://schemas.microsoft.com/office/2019/extlst" xmlns:r="http://schemas.openxmlformats.org/officeDocument/2006/relationships" xmlns:m="http://schemas.openxmlformats.org/officeDocument/2006/math" xmlns:v="urn:schemas-microsoft-com:vml" xmlns:wp14="http://schemas.microsoft.com/office/word/2010/wordprocessingDrawing" xmlns:wp="http://schemas.openxmlformats.org/drawingml/2006/wordprocessingDrawing" xmlns:w10="urn:schemas-microsoft-com:office:word" xmlns:w="http://schemas.openxmlformats.org/wordprocessingml/2006/main" xmlns:w14="http://schemas.microsoft.com/office/word/2010/wordml" xmlns:w15="http://schemas.microsoft.com/office/word/2012/wordml" xmlns:w16cei="http://schemas.microsoft.com/office/word/2026/wordml/cei" xmlns:w16cex="http://schemas.microsoft.com/office/word/2018/wordml/cex" xmlns:w16cid="http://schemas.microsoft.com/office/word/2016/wordml/cid" xmlns:w16="http://schemas.microsoft.com/office/word/2018/wordml" xmlns:w16du="http://schemas.microsoft.com/office/word/2023/wordml/word16du" xmlns:w16sdtdh="http://schemas.microsoft.com/office/word/2020/wordml/sdtdatahash" xmlns:w16sdtfl="http://schemas.microsoft.com/office/word/2024/wordml/sdtformatlock" xmlns:w16se="http://schemas.microsoft.com/office/word/2015/wordml/symex" xmlns:wpg="http://schemas.microsoft.com/office/word/2010/wordprocessingGroup" xmlns:wpi="http://schemas.microsoft.com/office/word/2010/wordprocessingInk" xmlns:wne="http://schemas.microsoft.com/office/word/2006/wordml" xmlns:wps="http://schemas.microsoft.com/office/word/2010/wordprocessingShape" mc:Ignorable="w14 w15 w16se w16cid w16 w16cex w16sdtdh w16sdtfl w16du wp14">
   <w:p>
     <w:pPr>
       <w:pStyle w:val="Footer"/>
@@ -1065,7 +1025,7 @@
 </file>
 
 <file path=word/footer2.xml><?xml version="1.0" encoding="utf-8"?>
-<w:ftr xmlns:wpc="http://schemas.microsoft.com/office/word/2010/wordprocessingCanvas" xmlns:cx="http://schemas.microsoft.com/office/drawing/2014/chartex" xmlns:cx1="http://schemas.microsoft.com/office/drawing/2015/9/8/chartex" xmlns:cx2="http://schemas.microsoft.com/office/drawing/2015/10/21/chartex" xmlns:cx3="http://schemas.microsoft.com/office/drawing/2016/5/9/chartex" xmlns:cx4="http://schemas.microsoft.com/office/drawing/2016/5/10/chartex" xmlns:cx5="http://schemas.microsoft.com/office/drawing/2016/5/11/chartex" xmlns:cx6="http://schemas.microsoft.com/office/drawing/2016/5/12/chartex" xmlns:cx7="http://schemas.microsoft.com/office/drawing/2016/5/13/chartex" xmlns:cx8="http://schemas.microsoft.com/office/drawing/2016/5/14/chartex" xmlns:mc="http://schemas.openxmlformats.org/markup-compatibility/2006" xmlns:aink="http://schemas.microsoft.com/office/drawing/2016/ink" xmlns:am3d="http://schemas.microsoft.com/office/drawing/2017/model3d" xmlns:o="urn:schemas-microsoft-com:office:office" xmlns:oel="http://schemas.microsoft.com/office/2019/extlst" xmlns:r="http://schemas.openxmlformats.org/officeDocument/2006/relationships" xmlns:m="http://schemas.openxmlformats.org/officeDocument/2006/math" xmlns:v="urn:schemas-microsoft-com:vml" xmlns:wp14="http://schemas.microsoft.com/office/word/2010/wordprocessingDrawing" xmlns:wp="http://schemas.openxmlformats.org/drawingml/2006/wordprocessingDrawing" xmlns:w10="urn:schemas-microsoft-com:office:word" xmlns:w="http://schemas.openxmlformats.org/wordprocessingml/2006/main" xmlns:w14="http://schemas.microsoft.com/office/word/2010/wordml" xmlns:w15="http://schemas.microsoft.com/office/word/2012/wordml" xmlns:w16cex="http://schemas.microsoft.com/office/word/2018/wordml/cex" xmlns:w16cid="http://schemas.microsoft.com/office/word/2016/wordml/cid" xmlns:w16="http://schemas.microsoft.com/office/word/2018/wordml" xmlns:w16du="http://schemas.microsoft.com/office/word/2023/wordml/word16du" xmlns:w16sdtdh="http://schemas.microsoft.com/office/word/2020/wordml/sdtdatahash" xmlns:w16sdtfl="http://schemas.microsoft.com/office/word/2024/wordml/sdtformatlock" xmlns:w16se="http://schemas.microsoft.com/office/word/2015/wordml/symex" xmlns:wpg="http://schemas.microsoft.com/office/word/2010/wordprocessingGroup" xmlns:wpi="http://schemas.microsoft.com/office/word/2010/wordprocessingInk" xmlns:wne="http://schemas.microsoft.com/office/word/2006/wordml" xmlns:wps="http://schemas.microsoft.com/office/word/2010/wordprocessingShape" mc:Ignorable="w14 w15 w16se w16cid w16 w16cex w16sdtdh w16sdtfl w16du wp14">
+<w:ftr xmlns:wpc="http://schemas.microsoft.com/office/word/2010/wordprocessingCanvas" xmlns:cx="http://schemas.microsoft.com/office/drawing/2014/chartex" xmlns:cx1="http://schemas.microsoft.com/office/drawing/2015/9/8/chartex" xmlns:cx2="http://schemas.microsoft.com/office/drawing/2015/10/21/chartex" xmlns:cx3="http://schemas.microsoft.com/office/drawing/2016/5/9/chartex" xmlns:cx4="http://schemas.microsoft.com/office/drawing/2016/5/10/chartex" xmlns:cx5="http://schemas.microsoft.com/office/drawing/2016/5/11/chartex" xmlns:cx6="http://schemas.microsoft.com/office/drawing/2016/5/12/chartex" xmlns:cx7="http://schemas.microsoft.com/office/drawing/2016/5/13/chartex" xmlns:cx8="http://schemas.microsoft.com/office/drawing/2016/5/14/chartex" xmlns:mc="http://schemas.openxmlformats.org/markup-compatibility/2006" xmlns:aink="http://schemas.microsoft.com/office/drawing/2016/ink" xmlns:am3d="http://schemas.microsoft.com/office/drawing/2017/model3d" xmlns:o="urn:schemas-microsoft-com:office:office" xmlns:oel="http://schemas.microsoft.com/office/2019/extlst" xmlns:r="http://schemas.openxmlformats.org/officeDocument/2006/relationships" xmlns:m="http://schemas.openxmlformats.org/officeDocument/2006/math" xmlns:v="urn:schemas-microsoft-com:vml" xmlns:wp14="http://schemas.microsoft.com/office/word/2010/wordprocessingDrawing" xmlns:wp="http://schemas.openxmlformats.org/drawingml/2006/wordprocessingDrawing" xmlns:w10="urn:schemas-microsoft-com:office:word" xmlns:w="http://schemas.openxmlformats.org/wordprocessingml/2006/main" xmlns:w14="http://schemas.microsoft.com/office/word/2010/wordml" xmlns:w15="http://schemas.microsoft.com/office/word/2012/wordml" xmlns:w16cei="http://schemas.microsoft.com/office/word/2026/wordml/cei" xmlns:w16cex="http://schemas.microsoft.com/office/word/2018/wordml/cex" xmlns:w16cid="http://schemas.microsoft.com/office/word/2016/wordml/cid" xmlns:w16="http://schemas.microsoft.com/office/word/2018/wordml" xmlns:w16du="http://schemas.microsoft.com/office/word/2023/wordml/word16du" xmlns:w16sdtdh="http://schemas.microsoft.com/office/word/2020/wordml/sdtdatahash" xmlns:w16sdtfl="http://schemas.microsoft.com/office/word/2024/wordml/sdtformatlock" xmlns:w16se="http://schemas.microsoft.com/office/word/2015/wordml/symex" xmlns:wpg="http://schemas.microsoft.com/office/word/2010/wordprocessingGroup" xmlns:wpi="http://schemas.microsoft.com/office/word/2010/wordprocessingInk" xmlns:wne="http://schemas.microsoft.com/office/word/2006/wordml" xmlns:wps="http://schemas.microsoft.com/office/word/2010/wordprocessingShape" mc:Ignorable="w14 w15 w16se w16cid w16 w16cex w16sdtdh w16sdtfl w16du wp14">
   <w:p>
     <w:pPr>
       <w:pStyle w:val="Footer"/>
@@ -1121,7 +1081,7 @@
 </file>
 
 <file path=word/footer3.xml><?xml version="1.0" encoding="utf-8"?>
-<w:ftr xmlns:wpc="http://schemas.microsoft.com/office/word/2010/wordprocessingCanvas" xmlns:cx="http://schemas.microsoft.com/office/drawing/2014/chartex" xmlns:cx1="http://schemas.microsoft.com/office/drawing/2015/9/8/chartex" xmlns:cx2="http://schemas.microsoft.com/office/drawing/2015/10/21/chartex" xmlns:cx3="http://schemas.microsoft.com/office/drawing/2016/5/9/chartex" xmlns:cx4="http://schemas.microsoft.com/office/drawing/2016/5/10/chartex" xmlns:cx5="http://schemas.microsoft.com/office/drawing/2016/5/11/chartex" xmlns:cx6="http://schemas.microsoft.com/office/drawing/2016/5/12/chartex" xmlns:cx7="http://schemas.microsoft.com/office/drawing/2016/5/13/chartex" xmlns:cx8="http://schemas.microsoft.com/office/drawing/2016/5/14/chartex" xmlns:mc="http://schemas.openxmlformats.org/markup-compatibility/2006" xmlns:aink="http://schemas.microsoft.com/office/drawing/2016/ink" xmlns:am3d="http://schemas.microsoft.com/office/drawing/2017/model3d" xmlns:o="urn:schemas-microsoft-com:office:office" xmlns:oel="http://schemas.microsoft.com/office/2019/extlst" xmlns:r="http://schemas.openxmlformats.org/officeDocument/2006/relationships" xmlns:m="http://schemas.openxmlformats.org/officeDocument/2006/math" xmlns:v="urn:schemas-microsoft-com:vml" xmlns:wp14="http://schemas.microsoft.com/office/word/2010/wordprocessingDrawing" xmlns:wp="http://schemas.openxmlformats.org/drawingml/2006/wordprocessingDrawing" xmlns:w10="urn:schemas-microsoft-com:office:word" xmlns:w="http://schemas.openxmlformats.org/wordprocessingml/2006/main" xmlns:w14="http://schemas.microsoft.com/office/word/2010/wordml" xmlns:w15="http://schemas.microsoft.com/office/word/2012/wordml" xmlns:w16cex="http://schemas.microsoft.com/office/word/2018/wordml/cex" xmlns:w16cid="http://schemas.microsoft.com/office/word/2016/wordml/cid" xmlns:w16="http://schemas.microsoft.com/office/word/2018/wordml" xmlns:w16du="http://schemas.microsoft.com/office/word/2023/wordml/word16du" xmlns:w16sdtdh="http://schemas.microsoft.com/office/word/2020/wordml/sdtdatahash" xmlns:w16sdtfl="http://schemas.microsoft.com/office/word/2024/wordml/sdtformatlock" xmlns:w16se="http://schemas.microsoft.com/office/word/2015/wordml/symex" xmlns:wpg="http://schemas.microsoft.com/office/word/2010/wordprocessingGroup" xmlns:wpi="http://schemas.microsoft.com/office/word/2010/wordprocessingInk" xmlns:wne="http://schemas.microsoft.com/office/word/2006/wordml" xmlns:wps="http://schemas.microsoft.com/office/word/2010/wordprocessingShape" mc:Ignorable="w14 w15 w16se w16cid w16 w16cex w16sdtdh w16sdtfl w16du wp14">
+<w:ftr xmlns:wpc="http://schemas.microsoft.com/office/word/2010/wordprocessingCanvas" xmlns:cx="http://schemas.microsoft.com/office/drawing/2014/chartex" xmlns:cx1="http://schemas.microsoft.com/office/drawing/2015/9/8/chartex" xmlns:cx2="http://schemas.microsoft.com/office/drawing/2015/10/21/chartex" xmlns:cx3="http://schemas.microsoft.com/office/drawing/2016/5/9/chartex" xmlns:cx4="http://schemas.microsoft.com/office/drawing/2016/5/10/chartex" xmlns:cx5="http://schemas.microsoft.com/office/drawing/2016/5/11/chartex" xmlns:cx6="http://schemas.microsoft.com/office/drawing/2016/5/12/chartex" xmlns:cx7="http://schemas.microsoft.com/office/drawing/2016/5/13/chartex" xmlns:cx8="http://schemas.microsoft.com/office/drawing/2016/5/14/chartex" xmlns:mc="http://schemas.openxmlformats.org/markup-compatibility/2006" xmlns:aink="http://schemas.microsoft.com/office/drawing/2016/ink" xmlns:am3d="http://schemas.microsoft.com/office/drawing/2017/model3d" xmlns:o="urn:schemas-microsoft-com:office:office" xmlns:oel="http://schemas.microsoft.com/office/2019/extlst" xmlns:r="http://schemas.openxmlformats.org/officeDocument/2006/relationships" xmlns:m="http://schemas.openxmlformats.org/officeDocument/2006/math" xmlns:v="urn:schemas-microsoft-com:vml" xmlns:wp14="http://schemas.microsoft.com/office/word/2010/wordprocessingDrawing" xmlns:wp="http://schemas.openxmlformats.org/drawingml/2006/wordprocessingDrawing" xmlns:w10="urn:schemas-microsoft-com:office:word" xmlns:w="http://schemas.openxmlformats.org/wordprocessingml/2006/main" xmlns:w14="http://schemas.microsoft.com/office/word/2010/wordml" xmlns:w15="http://schemas.microsoft.com/office/word/2012/wordml" xmlns:w16cei="http://schemas.microsoft.com/office/word/2026/wordml/cei" xmlns:w16cex="http://schemas.microsoft.com/office/word/2018/wordml/cex" xmlns:w16cid="http://schemas.microsoft.com/office/word/2016/wordml/cid" xmlns:w16="http://schemas.microsoft.com/office/word/2018/wordml" xmlns:w16du="http://schemas.microsoft.com/office/word/2023/wordml/word16du" xmlns:w16sdtdh="http://schemas.microsoft.com/office/word/2020/wordml/sdtdatahash" xmlns:w16sdtfl="http://schemas.microsoft.com/office/word/2024/wordml/sdtformatlock" xmlns:w16se="http://schemas.microsoft.com/office/word/2015/wordml/symex" xmlns:wpg="http://schemas.microsoft.com/office/word/2010/wordprocessingGroup" xmlns:wpi="http://schemas.microsoft.com/office/word/2010/wordprocessingInk" xmlns:wne="http://schemas.microsoft.com/office/word/2006/wordml" xmlns:wps="http://schemas.microsoft.com/office/word/2010/wordprocessingShape" mc:Ignorable="w14 w15 w16se w16cid w16 w16cex w16sdtdh w16sdtfl w16du wp14">
   <w:p>
     <w:pPr>
       <w:pStyle w:val="Footer"/>
@@ -1260,7 +1220,7 @@
 </file>
 
 <file path=word/footnotes.xml><?xml version="1.0" encoding="utf-8"?>
-<w:footnotes xmlns:wpc="http://schemas.microsoft.com/office/word/2010/wordprocessingCanvas" xmlns:cx="http://schemas.microsoft.com/office/drawing/2014/chartex" xmlns:cx1="http://schemas.microsoft.com/office/drawing/2015/9/8/chartex" xmlns:cx2="http://schemas.microsoft.com/office/drawing/2015/10/21/chartex" xmlns:cx3="http://schemas.microsoft.com/office/drawing/2016/5/9/chartex" xmlns:cx4="http://schemas.microsoft.com/office/drawing/2016/5/10/chartex" xmlns:cx5="http://schemas.microsoft.com/office/drawing/2016/5/11/chartex" xmlns:cx6="http://schemas.microsoft.com/office/drawing/2016/5/12/chartex" xmlns:cx7="http://schemas.microsoft.com/office/drawing/2016/5/13/chartex" xmlns:cx8="http://schemas.microsoft.com/office/drawing/2016/5/14/chartex" xmlns:mc="http://schemas.openxmlformats.org/markup-compatibility/2006" xmlns:aink="http://schemas.microsoft.com/office/drawing/2016/ink" xmlns:am3d="http://schemas.microsoft.com/office/drawing/2017/model3d" xmlns:o="urn:schemas-microsoft-com:office:office" xmlns:oel="http://schemas.microsoft.com/office/2019/extlst" xmlns:r="http://schemas.openxmlformats.org/officeDocument/2006/relationships" xmlns:m="http://schemas.openxmlformats.org/officeDocument/2006/math" xmlns:v="urn:schemas-microsoft-com:vml" xmlns:wp14="http://schemas.microsoft.com/office/word/2010/wordprocessingDrawing" xmlns:wp="http://schemas.openxmlformats.org/drawingml/2006/wordprocessingDrawing" xmlns:w10="urn:schemas-microsoft-com:office:word" xmlns:w="http://schemas.openxmlformats.org/wordprocessingml/2006/main" xmlns:w14="http://schemas.microsoft.com/office/word/2010/wordml" xmlns:w15="http://schemas.microsoft.com/office/word/2012/wordml" xmlns:w16cex="http://schemas.microsoft.com/office/word/2018/wordml/cex" xmlns:w16cid="http://schemas.microsoft.com/office/word/2016/wordml/cid" xmlns:w16="http://schemas.microsoft.com/office/word/2018/wordml" xmlns:w16du="http://schemas.microsoft.com/office/word/2023/wordml/word16du" xmlns:w16sdtdh="http://schemas.microsoft.com/office/word/2020/wordml/sdtdatahash" xmlns:w16sdtfl="http://schemas.microsoft.com/office/word/2024/wordml/sdtformatlock" xmlns:w16se="http://schemas.microsoft.com/office/word/2015/wordml/symex" xmlns:wpg="http://schemas.microsoft.com/office/word/2010/wordprocessingGroup" xmlns:wpi="http://schemas.microsoft.com/office/word/2010/wordprocessingInk" xmlns:wne="http://schemas.microsoft.com/office/word/2006/wordml" xmlns:wps="http://schemas.microsoft.com/office/word/2010/wordprocessingShape" mc:Ignorable="w14 w15 w16se w16cid w16 w16cex w16sdtdh w16sdtfl w16du wp14">
+<w:footnotes xmlns:wpc="http://schemas.microsoft.com/office/word/2010/wordprocessingCanvas" xmlns:cx="http://schemas.microsoft.com/office/drawing/2014/chartex" xmlns:cx1="http://schemas.microsoft.com/office/drawing/2015/9/8/chartex" xmlns:cx2="http://schemas.microsoft.com/office/drawing/2015/10/21/chartex" xmlns:cx3="http://schemas.microsoft.com/office/drawing/2016/5/9/chartex" xmlns:cx4="http://schemas.microsoft.com/office/drawing/2016/5/10/chartex" xmlns:cx5="http://schemas.microsoft.com/office/drawing/2016/5/11/chartex" xmlns:cx6="http://schemas.microsoft.com/office/drawing/2016/5/12/chartex" xmlns:cx7="http://schemas.microsoft.com/office/drawing/2016/5/13/chartex" xmlns:cx8="http://schemas.microsoft.com/office/drawing/2016/5/14/chartex" xmlns:mc="http://schemas.openxmlformats.org/markup-compatibility/2006" xmlns:aink="http://schemas.microsoft.com/office/drawing/2016/ink" xmlns:am3d="http://schemas.microsoft.com/office/drawing/2017/model3d" xmlns:o="urn:schemas-microsoft-com:office:office" xmlns:oel="http://schemas.microsoft.com/office/2019/extlst" xmlns:r="http://schemas.openxmlformats.org/officeDocument/2006/relationships" xmlns:m="http://schemas.openxmlformats.org/officeDocument/2006/math" xmlns:v="urn:schemas-microsoft-com:vml" xmlns:wp14="http://schemas.microsoft.com/office/word/2010/wordprocessingDrawing" xmlns:wp="http://schemas.openxmlformats.org/drawingml/2006/wordprocessingDrawing" xmlns:w10="urn:schemas-microsoft-com:office:word" xmlns:w="http://schemas.openxmlformats.org/wordprocessingml/2006/main" xmlns:w14="http://schemas.microsoft.com/office/word/2010/wordml" xmlns:w15="http://schemas.microsoft.com/office/word/2012/wordml" xmlns:w16cei="http://schemas.microsoft.com/office/word/2026/wordml/cei" xmlns:w16cex="http://schemas.microsoft.com/office/word/2018/wordml/cex" xmlns:w16cid="http://schemas.microsoft.com/office/word/2016/wordml/cid" xmlns:w16="http://schemas.microsoft.com/office/word/2018/wordml" xmlns:w16du="http://schemas.microsoft.com/office/word/2023/wordml/word16du" xmlns:w16sdtdh="http://schemas.microsoft.com/office/word/2020/wordml/sdtdatahash" xmlns:w16sdtfl="http://schemas.microsoft.com/office/word/2024/wordml/sdtformatlock" xmlns:w16se="http://schemas.microsoft.com/office/word/2015/wordml/symex" xmlns:wpg="http://schemas.microsoft.com/office/word/2010/wordprocessingGroup" xmlns:wpi="http://schemas.microsoft.com/office/word/2010/wordprocessingInk" xmlns:wne="http://schemas.microsoft.com/office/word/2006/wordml" xmlns:wps="http://schemas.microsoft.com/office/word/2010/wordprocessingShape" mc:Ignorable="w14 w15 w16se w16cid w16 w16cex w16sdtdh w16sdtfl w16du wp14">
   <w:footnote w:type="separator" w:id="-1">
     <w:p>
       <w:r>
@@ -1279,7 +1239,7 @@
 </file>
 
 <file path=word/header1.xml><?xml version="1.0" encoding="utf-8"?>
-<w:hdr xmlns:wpc="http://schemas.microsoft.com/office/word/2010/wordprocessingCanvas" xmlns:cx="http://schemas.microsoft.com/office/drawing/2014/chartex" xmlns:cx1="http://schemas.microsoft.com/office/drawing/2015/9/8/chartex" xmlns:cx2="http://schemas.microsoft.com/office/drawing/2015/10/21/chartex" xmlns:cx3="http://schemas.microsoft.com/office/drawing/2016/5/9/chartex" xmlns:cx4="http://schemas.microsoft.com/office/drawing/2016/5/10/chartex" xmlns:cx5="http://schemas.microsoft.com/office/drawing/2016/5/11/chartex" xmlns:cx6="http://schemas.microsoft.com/office/drawing/2016/5/12/chartex" xmlns:cx7="http://schemas.microsoft.com/office/drawing/2016/5/13/chartex" xmlns:cx8="http://schemas.microsoft.com/office/drawing/2016/5/14/chartex" xmlns:mc="http://schemas.openxmlformats.org/markup-compatibility/2006" xmlns:aink="http://schemas.microsoft.com/office/drawing/2016/ink" xmlns:am3d="http://schemas.microsoft.com/office/drawing/2017/model3d" xmlns:o="urn:schemas-microsoft-com:office:office" xmlns:oel="http://schemas.microsoft.com/office/2019/extlst" xmlns:r="http://schemas.openxmlformats.org/officeDocument/2006/relationships" xmlns:m="http://schemas.openxmlformats.org/officeDocument/2006/math" xmlns:v="urn:schemas-microsoft-com:vml" xmlns:wp14="http://schemas.microsoft.com/office/word/2010/wordprocessingDrawing" xmlns:wp="http://schemas.openxmlformats.org/drawingml/2006/wordprocessingDrawing" xmlns:w10="urn:schemas-microsoft-com:office:word" xmlns:w="http://schemas.openxmlformats.org/wordprocessingml/2006/main" xmlns:w14="http://schemas.microsoft.com/office/word/2010/wordml" xmlns:w15="http://schemas.microsoft.com/office/word/2012/wordml" xmlns:w16cex="http://schemas.microsoft.com/office/word/2018/wordml/cex" xmlns:w16cid="http://schemas.microsoft.com/office/word/2016/wordml/cid" xmlns:w16="http://schemas.microsoft.com/office/word/2018/wordml" xmlns:w16du="http://schemas.microsoft.com/office/word/2023/wordml/word16du" xmlns:w16sdtdh="http://schemas.microsoft.com/office/word/2020/wordml/sdtdatahash" xmlns:w16sdtfl="http://schemas.microsoft.com/office/word/2024/wordml/sdtformatlock" xmlns:w16se="http://schemas.microsoft.com/office/word/2015/wordml/symex" xmlns:wpg="http://schemas.microsoft.com/office/word/2010/wordprocessingGroup" xmlns:wpi="http://schemas.microsoft.com/office/word/2010/wordprocessingInk" xmlns:wne="http://schemas.microsoft.com/office/word/2006/wordml" xmlns:wps="http://schemas.microsoft.com/office/word/2010/wordprocessingShape" mc:Ignorable="w14 w15 w16se w16cid w16 w16cex w16sdtdh w16sdtfl w16du wp14">
+<w:hdr xmlns:wpc="http://schemas.microsoft.com/office/word/2010/wordprocessingCanvas" xmlns:cx="http://schemas.microsoft.com/office/drawing/2014/chartex" xmlns:cx1="http://schemas.microsoft.com/office/drawing/2015/9/8/chartex" xmlns:cx2="http://schemas.microsoft.com/office/drawing/2015/10/21/chartex" xmlns:cx3="http://schemas.microsoft.com/office/drawing/2016/5/9/chartex" xmlns:cx4="http://schemas.microsoft.com/office/drawing/2016/5/10/chartex" xmlns:cx5="http://schemas.microsoft.com/office/drawing/2016/5/11/chartex" xmlns:cx6="http://schemas.microsoft.com/office/drawing/2016/5/12/chartex" xmlns:cx7="http://schemas.microsoft.com/office/drawing/2016/5/13/chartex" xmlns:cx8="http://schemas.microsoft.com/office/drawing/2016/5/14/chartex" xmlns:mc="http://schemas.openxmlformats.org/markup-compatibility/2006" xmlns:aink="http://schemas.microsoft.com/office/drawing/2016/ink" xmlns:am3d="http://schemas.microsoft.com/office/drawing/2017/model3d" xmlns:o="urn:schemas-microsoft-com:office:office" xmlns:oel="http://schemas.microsoft.com/office/2019/extlst" xmlns:r="http://schemas.openxmlformats.org/officeDocument/2006/relationships" xmlns:m="http://schemas.openxmlformats.org/officeDocument/2006/math" xmlns:v="urn:schemas-microsoft-com:vml" xmlns:wp14="http://schemas.microsoft.com/office/word/2010/wordprocessingDrawing" xmlns:wp="http://schemas.openxmlformats.org/drawingml/2006/wordprocessingDrawing" xmlns:w10="urn:schemas-microsoft-com:office:word" xmlns:w="http://schemas.openxmlformats.org/wordprocessingml/2006/main" xmlns:w14="http://schemas.microsoft.com/office/word/2010/wordml" xmlns:w15="http://schemas.microsoft.com/office/word/2012/wordml" xmlns:w16cei="http://schemas.microsoft.com/office/word/2026/wordml/cei" xmlns:w16cex="http://schemas.microsoft.com/office/word/2018/wordml/cex" xmlns:w16cid="http://schemas.microsoft.com/office/word/2016/wordml/cid" xmlns:w16="http://schemas.microsoft.com/office/word/2018/wordml" xmlns:w16du="http://schemas.microsoft.com/office/word/2023/wordml/word16du" xmlns:w16sdtdh="http://schemas.microsoft.com/office/word/2020/wordml/sdtdatahash" xmlns:w16sdtfl="http://schemas.microsoft.com/office/word/2024/wordml/sdtformatlock" xmlns:w16se="http://schemas.microsoft.com/office/word/2015/wordml/symex" xmlns:wpg="http://schemas.microsoft.com/office/word/2010/wordprocessingGroup" xmlns:wpi="http://schemas.microsoft.com/office/word/2010/wordprocessingInk" xmlns:wne="http://schemas.microsoft.com/office/word/2006/wordml" xmlns:wps="http://schemas.microsoft.com/office/word/2010/wordprocessingShape" mc:Ignorable="w14 w15 w16se w16cid w16 w16cex w16sdtdh w16sdtfl w16du wp14">
   <w:p>
     <w:pPr>
       <w:pStyle w:val="Header"/>
@@ -1289,10 +1249,54 @@
 </file>
 
 <file path=word/header2.xml><?xml version="1.0" encoding="utf-8"?>
-<w:hdr xmlns:wpc="http://schemas.microsoft.com/office/word/2010/wordprocessingCanvas" xmlns:cx="http://schemas.microsoft.com/office/drawing/2014/chartex" xmlns:cx1="http://schemas.microsoft.com/office/drawing/2015/9/8/chartex" xmlns:cx2="http://schemas.microsoft.com/office/drawing/2015/10/21/chartex" xmlns:cx3="http://schemas.microsoft.com/office/drawing/2016/5/9/chartex" xmlns:cx4="http://schemas.microsoft.com/office/drawing/2016/5/10/chartex" xmlns:cx5="http://schemas.microsoft.com/office/drawing/2016/5/11/chartex" xmlns:cx6="http://schemas.microsoft.com/office/drawing/2016/5/12/chartex" xmlns:cx7="http://schemas.microsoft.com/office/drawing/2016/5/13/chartex" xmlns:cx8="http://schemas.microsoft.com/office/drawing/2016/5/14/chartex" xmlns:mc="http://schemas.openxmlformats.org/markup-compatibility/2006" xmlns:aink="http://schemas.microsoft.com/office/drawing/2016/ink" xmlns:am3d="http://schemas.microsoft.com/office/drawing/2017/model3d" xmlns:o="urn:schemas-microsoft-com:office:office" xmlns:oel="http://schemas.microsoft.com/office/2019/extlst" xmlns:r="http://schemas.openxmlformats.org/officeDocument/2006/relationships" xmlns:m="http://schemas.openxmlformats.org/officeDocument/2006/math" xmlns:v="urn:schemas-microsoft-com:vml" xmlns:wp14="http://schemas.microsoft.com/office/word/2010/wordprocessingDrawing" xmlns:wp="http://schemas.openxmlformats.org/drawingml/2006/wordprocessingDrawing" xmlns:w10="urn:schemas-microsoft-com:office:word" xmlns:w="http://schemas.openxmlformats.org/wordprocessingml/2006/main" xmlns:w14="http://schemas.microsoft.com/office/word/2010/wordml" xmlns:w15="http://schemas.microsoft.com/office/word/2012/wordml" xmlns:w16cex="http://schemas.microsoft.com/office/word/2018/wordml/cex" xmlns:w16cid="http://schemas.microsoft.com/office/word/2016/wordml/cid" xmlns:w16="http://schemas.microsoft.com/office/word/2018/wordml" xmlns:w16du="http://schemas.microsoft.com/office/word/2023/wordml/word16du" xmlns:w16sdtdh="http://schemas.microsoft.com/office/word/2020/wordml/sdtdatahash" xmlns:w16sdtfl="http://schemas.microsoft.com/office/word/2024/wordml/sdtformatlock" xmlns:w16se="http://schemas.microsoft.com/office/word/2015/wordml/symex" xmlns:wpg="http://schemas.microsoft.com/office/word/2010/wordprocessingGroup" xmlns:wpi="http://schemas.microsoft.com/office/word/2010/wordprocessingInk" xmlns:wne="http://schemas.microsoft.com/office/word/2006/wordml" xmlns:wps="http://schemas.microsoft.com/office/word/2010/wordprocessingShape" mc:Ignorable="w14 w15 w16se w16cid w16 w16cex w16sdtdh w16sdtfl w16du wp14">
-  <w:p/>
-  <w:p/>
-  <w:p/>
+<w:hdr xmlns:wpc="http://schemas.microsoft.com/office/word/2010/wordprocessingCanvas" xmlns:cx="http://schemas.microsoft.com/office/drawing/2014/chartex" xmlns:cx1="http://schemas.microsoft.com/office/drawing/2015/9/8/chartex" xmlns:cx2="http://schemas.microsoft.com/office/drawing/2015/10/21/chartex" xmlns:cx3="http://schemas.microsoft.com/office/drawing/2016/5/9/chartex" xmlns:cx4="http://schemas.microsoft.com/office/drawing/2016/5/10/chartex" xmlns:cx5="http://schemas.microsoft.com/office/drawing/2016/5/11/chartex" xmlns:cx6="http://schemas.microsoft.com/office/drawing/2016/5/12/chartex" xmlns:cx7="http://schemas.microsoft.com/office/drawing/2016/5/13/chartex" xmlns:cx8="http://schemas.microsoft.com/office/drawing/2016/5/14/chartex" xmlns:mc="http://schemas.openxmlformats.org/markup-compatibility/2006" xmlns:aink="http://schemas.microsoft.com/office/drawing/2016/ink" xmlns:am3d="http://schemas.microsoft.com/office/drawing/2017/model3d" xmlns:o="urn:schemas-microsoft-com:office:office" xmlns:oel="http://schemas.microsoft.com/office/2019/extlst" xmlns:r="http://schemas.openxmlformats.org/officeDocument/2006/relationships" xmlns:m="http://schemas.openxmlformats.org/officeDocument/2006/math" xmlns:v="urn:schemas-microsoft-com:vml" xmlns:wp14="http://schemas.microsoft.com/office/word/2010/wordprocessingDrawing" xmlns:wp="http://schemas.openxmlformats.org/drawingml/2006/wordprocessingDrawing" xmlns:w10="urn:schemas-microsoft-com:office:word" xmlns:w="http://schemas.openxmlformats.org/wordprocessingml/2006/main" xmlns:w14="http://schemas.microsoft.com/office/word/2010/wordml" xmlns:w15="http://schemas.microsoft.com/office/word/2012/wordml" xmlns:w16cei="http://schemas.microsoft.com/office/word/2026/wordml/cei" xmlns:w16cex="http://schemas.microsoft.com/office/word/2018/wordml/cex" xmlns:w16cid="http://schemas.microsoft.com/office/word/2016/wordml/cid" xmlns:w16="http://schemas.microsoft.com/office/word/2018/wordml" xmlns:w16du="http://schemas.microsoft.com/office/word/2023/wordml/word16du" xmlns:w16sdtdh="http://schemas.microsoft.com/office/word/2020/wordml/sdtdatahash" xmlns:w16sdtfl="http://schemas.microsoft.com/office/word/2024/wordml/sdtformatlock" xmlns:w16se="http://schemas.microsoft.com/office/word/2015/wordml/symex" xmlns:wpg="http://schemas.microsoft.com/office/word/2010/wordprocessingGroup" xmlns:wpi="http://schemas.microsoft.com/office/word/2010/wordprocessingInk" xmlns:wne="http://schemas.microsoft.com/office/word/2006/wordml" xmlns:wps="http://schemas.microsoft.com/office/word/2010/wordprocessingShape" mc:Ignorable="w14 w15 w16se w16cid w16 w16cex w16sdtdh w16sdtfl w16du wp14">
+  <w:p>
+    <w:r>
+      <w:rPr>
+        <w:rFonts w:cs="Arial"/>
+        <w:i/>
+        <w:noProof/>
+        <w:color w:val="2F2A85"/>
+        <w:sz w:val="22"/>
+        <w:lang w:val="en-US"/>
+      </w:rPr>
+      <w:drawing>
+        <wp:inline distT="0" distB="0" distL="0" distR="0" wp14:anchorId="35FCF9BA" wp14:editId="4505226C">
+          <wp:extent cx="5416828" cy="749339"/>
+          <wp:effectExtent l="0" t="0" r="0" b="0"/>
+          <wp:docPr id="1315149021" name="Picture 1"/>
+          <wp:cNvGraphicFramePr>
+            <a:graphicFrameLocks xmlns:a="http://schemas.openxmlformats.org/drawingml/2006/main" noChangeAspect="1"/>
+          </wp:cNvGraphicFramePr>
+          <a:graphic xmlns:a="http://schemas.openxmlformats.org/drawingml/2006/main">
+            <a:graphicData uri="http://schemas.openxmlformats.org/drawingml/2006/picture">
+              <pic:pic xmlns:pic="http://schemas.openxmlformats.org/drawingml/2006/picture">
+                <pic:nvPicPr>
+                  <pic:cNvPr id="2083801934" name=""/>
+                  <pic:cNvPicPr/>
+                </pic:nvPicPr>
+                <pic:blipFill>
+                  <a:blip r:embed="rId1"/>
+                  <a:stretch>
+                    <a:fillRect/>
+                  </a:stretch>
+                </pic:blipFill>
+                <pic:spPr>
+                  <a:xfrm>
+                    <a:off x="0" y="0"/>
+                    <a:ext cx="5416828" cy="749339"/>
+                  </a:xfrm>
+                  <a:prstGeom prst="rect">
+                    <a:avLst/>
+                  </a:prstGeom>
+                </pic:spPr>
+              </pic:pic>
+            </a:graphicData>
+          </a:graphic>
+        </wp:inline>
+      </w:drawing>
+    </w:r>
+  </w:p>
   <w:p/>
   <w:tbl>
     <w:tblPr>
@@ -1337,7 +1341,18 @@
               <w:sz w:val="22"/>
               <w:lang w:val="en-US"/>
             </w:rPr>
-            <w:t>5</w:t>
+            <w:t>6</w:t>
+          </w:r>
+          <w:r>
+            <w:rPr>
+              <w:rFonts w:cs="Arial"/>
+              <w:i/>
+              <w:color w:val="2F2A85"/>
+              <w:sz w:val="22"/>
+              <w:vertAlign w:val="superscript"/>
+              <w:lang w:val="en-US"/>
+            </w:rPr>
+            <w:t>th</w:t>
           </w:r>
           <w:r>
             <w:rPr>
@@ -1347,7 +1362,7 @@
               <w:sz w:val="22"/>
               <w:lang w:val="en-US"/>
             </w:rPr>
-            <w:t>th Asian Quantitative In</w:t>
+            <w:t>Asian Quantitative In</w:t>
           </w:r>
           <w:proofErr w:type="spellStart"/>
           <w:r>
@@ -1376,7 +1391,7 @@
               <w:color w:val="2F2A85"/>
               <w:sz w:val="22"/>
             </w:rPr>
-            <w:t>July</w:t>
+            <w:t>March</w:t>
           </w:r>
           <w:r>
             <w:rPr>
@@ -1394,7 +1409,25 @@
               <w:color w:val="2F2A85"/>
               <w:sz w:val="22"/>
             </w:rPr>
-            <w:t>14~18</w:t>
+            <w:t>07-</w:t>
+          </w:r>
+          <w:r>
+            <w:rPr>
+              <w:rFonts w:cs="Arial"/>
+              <w:i/>
+              <w:color w:val="2F2A85"/>
+              <w:sz w:val="22"/>
+            </w:rPr>
+            <w:t>1</w:t>
+          </w:r>
+          <w:r>
+            <w:rPr>
+              <w:rFonts w:cs="Arial"/>
+              <w:i/>
+              <w:color w:val="2F2A85"/>
+              <w:sz w:val="22"/>
+            </w:rPr>
+            <w:t>0</w:t>
           </w:r>
           <w:r>
             <w:rPr>
@@ -1412,7 +1445,7 @@
               <w:color w:val="2F2A85"/>
               <w:sz w:val="22"/>
             </w:rPr>
-            <w:t>5</w:t>
+            <w:t>7</w:t>
           </w:r>
           <w:r>
             <w:rPr>
@@ -1430,25 +1463,7 @@
               <w:color w:val="2F2A85"/>
               <w:sz w:val="22"/>
             </w:rPr>
-            <w:t>Harbin</w:t>
-          </w:r>
-          <w:r>
-            <w:rPr>
-              <w:rFonts w:cs="Arial"/>
-              <w:i/>
-              <w:color w:val="2F2A85"/>
-              <w:sz w:val="22"/>
-            </w:rPr>
-            <w:t xml:space="preserve">, </w:t>
-          </w:r>
-          <w:r>
-            <w:rPr>
-              <w:rFonts w:cs="Arial"/>
-              <w:i/>
-              <w:color w:val="2F2A85"/>
-              <w:sz w:val="22"/>
-            </w:rPr>
-            <w:t>China</w:t>
+            <w:t>Singapore</w:t>
           </w:r>
           <w:r>
             <w:rPr>
@@ -1488,7 +1503,7 @@
 </file>
 
 <file path=word/header3.xml><?xml version="1.0" encoding="utf-8"?>
-<w:hdr xmlns:wpc="http://schemas.microsoft.com/office/word/2010/wordprocessingCanvas" xmlns:cx="http://schemas.microsoft.com/office/drawing/2014/chartex" xmlns:cx1="http://schemas.microsoft.com/office/drawing/2015/9/8/chartex" xmlns:cx2="http://schemas.microsoft.com/office/drawing/2015/10/21/chartex" xmlns:cx3="http://schemas.microsoft.com/office/drawing/2016/5/9/chartex" xmlns:cx4="http://schemas.microsoft.com/office/drawing/2016/5/10/chartex" xmlns:cx5="http://schemas.microsoft.com/office/drawing/2016/5/11/chartex" xmlns:cx6="http://schemas.microsoft.com/office/drawing/2016/5/12/chartex" xmlns:cx7="http://schemas.microsoft.com/office/drawing/2016/5/13/chartex" xmlns:cx8="http://schemas.microsoft.com/office/drawing/2016/5/14/chartex" xmlns:mc="http://schemas.openxmlformats.org/markup-compatibility/2006" xmlns:aink="http://schemas.microsoft.com/office/drawing/2016/ink" xmlns:am3d="http://schemas.microsoft.com/office/drawing/2017/model3d" xmlns:o="urn:schemas-microsoft-com:office:office" xmlns:oel="http://schemas.microsoft.com/office/2019/extlst" xmlns:r="http://schemas.openxmlformats.org/officeDocument/2006/relationships" xmlns:m="http://schemas.openxmlformats.org/officeDocument/2006/math" xmlns:v="urn:schemas-microsoft-com:vml" xmlns:wp14="http://schemas.microsoft.com/office/word/2010/wordprocessingDrawing" xmlns:wp="http://schemas.openxmlformats.org/drawingml/2006/wordprocessingDrawing" xmlns:w10="urn:schemas-microsoft-com:office:word" xmlns:w="http://schemas.openxmlformats.org/wordprocessingml/2006/main" xmlns:w14="http://schemas.microsoft.com/office/word/2010/wordml" xmlns:w15="http://schemas.microsoft.com/office/word/2012/wordml" xmlns:w16cex="http://schemas.microsoft.com/office/word/2018/wordml/cex" xmlns:w16cid="http://schemas.microsoft.com/office/word/2016/wordml/cid" xmlns:w16="http://schemas.microsoft.com/office/word/2018/wordml" xmlns:w16du="http://schemas.microsoft.com/office/word/2023/wordml/word16du" xmlns:w16sdtdh="http://schemas.microsoft.com/office/word/2020/wordml/sdtdatahash" xmlns:w16sdtfl="http://schemas.microsoft.com/office/word/2024/wordml/sdtformatlock" xmlns:w16se="http://schemas.microsoft.com/office/word/2015/wordml/symex" xmlns:wpg="http://schemas.microsoft.com/office/word/2010/wordprocessingGroup" xmlns:wpi="http://schemas.microsoft.com/office/word/2010/wordprocessingInk" xmlns:wne="http://schemas.microsoft.com/office/word/2006/wordml" xmlns:wps="http://schemas.microsoft.com/office/word/2010/wordprocessingShape" mc:Ignorable="w14 w15 w16se w16cid w16 w16cex w16sdtdh w16sdtfl w16du wp14">
+<w:hdr xmlns:wpc="http://schemas.microsoft.com/office/word/2010/wordprocessingCanvas" xmlns:cx="http://schemas.microsoft.com/office/drawing/2014/chartex" xmlns:cx1="http://schemas.microsoft.com/office/drawing/2015/9/8/chartex" xmlns:cx2="http://schemas.microsoft.com/office/drawing/2015/10/21/chartex" xmlns:cx3="http://schemas.microsoft.com/office/drawing/2016/5/9/chartex" xmlns:cx4="http://schemas.microsoft.com/office/drawing/2016/5/10/chartex" xmlns:cx5="http://schemas.microsoft.com/office/drawing/2016/5/11/chartex" xmlns:cx6="http://schemas.microsoft.com/office/drawing/2016/5/12/chartex" xmlns:cx7="http://schemas.microsoft.com/office/drawing/2016/5/13/chartex" xmlns:cx8="http://schemas.microsoft.com/office/drawing/2016/5/14/chartex" xmlns:mc="http://schemas.openxmlformats.org/markup-compatibility/2006" xmlns:aink="http://schemas.microsoft.com/office/drawing/2016/ink" xmlns:am3d="http://schemas.microsoft.com/office/drawing/2017/model3d" xmlns:o="urn:schemas-microsoft-com:office:office" xmlns:oel="http://schemas.microsoft.com/office/2019/extlst" xmlns:r="http://schemas.openxmlformats.org/officeDocument/2006/relationships" xmlns:m="http://schemas.openxmlformats.org/officeDocument/2006/math" xmlns:v="urn:schemas-microsoft-com:vml" xmlns:wp14="http://schemas.microsoft.com/office/word/2010/wordprocessingDrawing" xmlns:wp="http://schemas.openxmlformats.org/drawingml/2006/wordprocessingDrawing" xmlns:w10="urn:schemas-microsoft-com:office:word" xmlns:w="http://schemas.openxmlformats.org/wordprocessingml/2006/main" xmlns:w14="http://schemas.microsoft.com/office/word/2010/wordml" xmlns:w15="http://schemas.microsoft.com/office/word/2012/wordml" xmlns:w16cei="http://schemas.microsoft.com/office/word/2026/wordml/cei" xmlns:w16cex="http://schemas.microsoft.com/office/word/2018/wordml/cex" xmlns:w16cid="http://schemas.microsoft.com/office/word/2016/wordml/cid" xmlns:w16="http://schemas.microsoft.com/office/word/2018/wordml" xmlns:w16du="http://schemas.microsoft.com/office/word/2023/wordml/word16du" xmlns:w16sdtdh="http://schemas.microsoft.com/office/word/2020/wordml/sdtdatahash" xmlns:w16sdtfl="http://schemas.microsoft.com/office/word/2024/wordml/sdtformatlock" xmlns:w16se="http://schemas.microsoft.com/office/word/2015/wordml/symex" xmlns:wpg="http://schemas.microsoft.com/office/word/2010/wordprocessingGroup" xmlns:wpi="http://schemas.microsoft.com/office/word/2010/wordprocessingInk" xmlns:wne="http://schemas.microsoft.com/office/word/2006/wordml" xmlns:wps="http://schemas.microsoft.com/office/word/2010/wordprocessingShape" mc:Ignorable="w14 w15 w16se w16cid w16 w16cex w16sdtdh w16sdtfl w16du wp14">
   <w:tbl>
     <w:tblPr>
       <w:tblStyle w:val="TableGrid"/>
@@ -1498,13 +1513,13 @@
       <w:tblLook w:val="04A0" w:firstRow="1" w:lastRow="0" w:firstColumn="1" w:lastColumn="0" w:noHBand="0" w:noVBand="1"/>
     </w:tblPr>
     <w:tblGrid>
-      <w:gridCol w:w="3970"/>
-      <w:gridCol w:w="6521"/>
+      <w:gridCol w:w="2269"/>
+      <w:gridCol w:w="8222"/>
     </w:tblGrid>
     <w:tr>
       <w:tc>
         <w:tcPr>
-          <w:tcW w:w="3970" w:type="dxa"/>
+          <w:tcW w:w="2269" w:type="dxa"/>
           <w:tcBorders>
             <w:top w:val="nil"/>
             <w:left w:val="nil"/>
@@ -1583,7 +1598,7 @@
       </w:tc>
       <w:tc>
         <w:tcPr>
-          <w:tcW w:w="6521" w:type="dxa"/>
+          <w:tcW w:w="8222" w:type="dxa"/>
           <w:tcBorders>
             <w:top w:val="nil"/>
             <w:left w:val="nil"/>
@@ -1592,6 +1607,65 @@
           </w:tcBorders>
           <w:vAlign w:val="center"/>
         </w:tcPr>
+        <w:p>
+          <w:pPr>
+            <w:widowControl w:val="0"/>
+            <w:ind w:firstLine="0"/>
+            <w:jc w:val="center"/>
+            <w:rPr>
+              <w:rFonts w:cs="Arial"/>
+              <w:i/>
+              <w:color w:val="2F2A85"/>
+              <w:sz w:val="22"/>
+              <w:lang w:val="en-US"/>
+            </w:rPr>
+          </w:pPr>
+          <w:r>
+            <w:rPr>
+              <w:rFonts w:cs="Arial"/>
+              <w:i/>
+              <w:noProof/>
+              <w:color w:val="2F2A85"/>
+              <w:sz w:val="22"/>
+              <w:lang w:val="en-US"/>
+            </w:rPr>
+            <w:drawing>
+              <wp:inline distT="0" distB="0" distL="0" distR="0" wp14:anchorId="51C43CA7" wp14:editId="7057A16A">
+                <wp:extent cx="5416828" cy="749339"/>
+                <wp:effectExtent l="0" t="0" r="0" b="0"/>
+                <wp:docPr id="2083801934" name="Picture 1"/>
+                <wp:cNvGraphicFramePr>
+                  <a:graphicFrameLocks xmlns:a="http://schemas.openxmlformats.org/drawingml/2006/main" noChangeAspect="1"/>
+                </wp:cNvGraphicFramePr>
+                <a:graphic xmlns:a="http://schemas.openxmlformats.org/drawingml/2006/main">
+                  <a:graphicData uri="http://schemas.openxmlformats.org/drawingml/2006/picture">
+                    <pic:pic xmlns:pic="http://schemas.openxmlformats.org/drawingml/2006/picture">
+                      <pic:nvPicPr>
+                        <pic:cNvPr id="2083801934" name=""/>
+                        <pic:cNvPicPr/>
+                      </pic:nvPicPr>
+                      <pic:blipFill>
+                        <a:blip r:embed="rId2"/>
+                        <a:stretch>
+                          <a:fillRect/>
+                        </a:stretch>
+                      </pic:blipFill>
+                      <pic:spPr>
+                        <a:xfrm>
+                          <a:off x="0" y="0"/>
+                          <a:ext cx="5416828" cy="749339"/>
+                        </a:xfrm>
+                        <a:prstGeom prst="rect">
+                          <a:avLst/>
+                        </a:prstGeom>
+                      </pic:spPr>
+                    </pic:pic>
+                  </a:graphicData>
+                </a:graphic>
+              </wp:inline>
+            </w:drawing>
+          </w:r>
+        </w:p>
         <w:p>
           <w:pPr>
             <w:widowControl w:val="0"/>
@@ -1621,9 +1695,30 @@
               <w:i/>
               <w:color w:val="2F2A85"/>
               <w:sz w:val="22"/>
+              <w:vertAlign w:val="superscript"/>
               <w:lang w:val="en-US"/>
             </w:rPr>
-            <w:t>th Asian Quantitative InfraRed Thermography Conference</w:t>
+            <w:t>th</w:t>
+          </w:r>
+          <w:r>
+            <w:rPr>
+              <w:rFonts w:cs="Arial"/>
+              <w:i/>
+              <w:color w:val="2F2A85"/>
+              <w:sz w:val="22"/>
+              <w:lang w:val="en-US"/>
+            </w:rPr>
+            <w:t xml:space="preserve"> </w:t>
+          </w:r>
+          <w:r>
+            <w:rPr>
+              <w:rFonts w:cs="Arial"/>
+              <w:i/>
+              <w:color w:val="2F2A85"/>
+              <w:sz w:val="22"/>
+              <w:lang w:val="en-US"/>
+            </w:rPr>
+            <w:t>Asian Quantitative InfraRed Thermography Conference</w:t>
           </w:r>
         </w:p>
         <w:p>
@@ -1653,7 +1748,7 @@
 </file>
 
 <file path=word/numbering.xml><?xml version="1.0" encoding="utf-8"?>
-<w:numbering xmlns:wpc="http://schemas.microsoft.com/office/word/2010/wordprocessingCanvas" xmlns:cx="http://schemas.microsoft.com/office/drawing/2014/chartex" xmlns:cx1="http://schemas.microsoft.com/office/drawing/2015/9/8/chartex" xmlns:cx2="http://schemas.microsoft.com/office/drawing/2015/10/21/chartex" xmlns:cx3="http://schemas.microsoft.com/office/drawing/2016/5/9/chartex" xmlns:cx4="http://schemas.microsoft.com/office/drawing/2016/5/10/chartex" xmlns:cx5="http://schemas.microsoft.com/office/drawing/2016/5/11/chartex" xmlns:cx6="http://schemas.microsoft.com/office/drawing/2016/5/12/chartex" xmlns:cx7="http://schemas.microsoft.com/office/drawing/2016/5/13/chartex" xmlns:cx8="http://schemas.microsoft.com/office/drawing/2016/5/14/chartex" xmlns:mc="http://schemas.openxmlformats.org/markup-compatibility/2006" xmlns:aink="http://schemas.microsoft.com/office/drawing/2016/ink" xmlns:am3d="http://schemas.microsoft.com/office/drawing/2017/model3d" xmlns:o="urn:schemas-microsoft-com:office:office" xmlns:oel="http://schemas.microsoft.com/office/2019/extlst" xmlns:r="http://schemas.openxmlformats.org/officeDocument/2006/relationships" xmlns:m="http://schemas.openxmlformats.org/officeDocument/2006/math" xmlns:v="urn:schemas-microsoft-com:vml" xmlns:wp14="http://schemas.microsoft.com/office/word/2010/wordprocessingDrawing" xmlns:wp="http://schemas.openxmlformats.org/drawingml/2006/wordprocessingDrawing" xmlns:w10="urn:schemas-microsoft-com:office:word" xmlns:w="http://schemas.openxmlformats.org/wordprocessingml/2006/main" xmlns:w14="http://schemas.microsoft.com/office/word/2010/wordml" xmlns:w15="http://schemas.microsoft.com/office/word/2012/wordml" xmlns:w16cex="http://schemas.microsoft.com/office/word/2018/wordml/cex" xmlns:w16cid="http://schemas.microsoft.com/office/word/2016/wordml/cid" xmlns:w16="http://schemas.microsoft.com/office/word/2018/wordml" xmlns:w16du="http://schemas.microsoft.com/office/word/2023/wordml/word16du" xmlns:w16sdtdh="http://schemas.microsoft.com/office/word/2020/wordml/sdtdatahash" xmlns:w16sdtfl="http://schemas.microsoft.com/office/word/2024/wordml/sdtformatlock" xmlns:w16se="http://schemas.microsoft.com/office/word/2015/wordml/symex" xmlns:wpg="http://schemas.microsoft.com/office/word/2010/wordprocessingGroup" xmlns:wpi="http://schemas.microsoft.com/office/word/2010/wordprocessingInk" xmlns:wne="http://schemas.microsoft.com/office/word/2006/wordml" xmlns:wps="http://schemas.microsoft.com/office/word/2010/wordprocessingShape" mc:Ignorable="w14 w15 w16se w16cid w16 w16cex w16sdtdh w16sdtfl w16du wp14">
+<w:numbering xmlns:wpc="http://schemas.microsoft.com/office/word/2010/wordprocessingCanvas" xmlns:cx="http://schemas.microsoft.com/office/drawing/2014/chartex" xmlns:cx1="http://schemas.microsoft.com/office/drawing/2015/9/8/chartex" xmlns:cx2="http://schemas.microsoft.com/office/drawing/2015/10/21/chartex" xmlns:cx3="http://schemas.microsoft.com/office/drawing/2016/5/9/chartex" xmlns:cx4="http://schemas.microsoft.com/office/drawing/2016/5/10/chartex" xmlns:cx5="http://schemas.microsoft.com/office/drawing/2016/5/11/chartex" xmlns:cx6="http://schemas.microsoft.com/office/drawing/2016/5/12/chartex" xmlns:cx7="http://schemas.microsoft.com/office/drawing/2016/5/13/chartex" xmlns:cx8="http://schemas.microsoft.com/office/drawing/2016/5/14/chartex" xmlns:mc="http://schemas.openxmlformats.org/markup-compatibility/2006" xmlns:aink="http://schemas.microsoft.com/office/drawing/2016/ink" xmlns:am3d="http://schemas.microsoft.com/office/drawing/2017/model3d" xmlns:o="urn:schemas-microsoft-com:office:office" xmlns:oel="http://schemas.microsoft.com/office/2019/extlst" xmlns:r="http://schemas.openxmlformats.org/officeDocument/2006/relationships" xmlns:m="http://schemas.openxmlformats.org/officeDocument/2006/math" xmlns:v="urn:schemas-microsoft-com:vml" xmlns:wp14="http://schemas.microsoft.com/office/word/2010/wordprocessingDrawing" xmlns:wp="http://schemas.openxmlformats.org/drawingml/2006/wordprocessingDrawing" xmlns:w10="urn:schemas-microsoft-com:office:word" xmlns:w="http://schemas.openxmlformats.org/wordprocessingml/2006/main" xmlns:w14="http://schemas.microsoft.com/office/word/2010/wordml" xmlns:w15="http://schemas.microsoft.com/office/word/2012/wordml" xmlns:w16cei="http://schemas.microsoft.com/office/word/2026/wordml/cei" xmlns:w16cex="http://schemas.microsoft.com/office/word/2018/wordml/cex" xmlns:w16cid="http://schemas.microsoft.com/office/word/2016/wordml/cid" xmlns:w16="http://schemas.microsoft.com/office/word/2018/wordml" xmlns:w16du="http://schemas.microsoft.com/office/word/2023/wordml/word16du" xmlns:w16sdtdh="http://schemas.microsoft.com/office/word/2020/wordml/sdtdatahash" xmlns:w16sdtfl="http://schemas.microsoft.com/office/word/2024/wordml/sdtformatlock" xmlns:w16se="http://schemas.microsoft.com/office/word/2015/wordml/symex" xmlns:wpg="http://schemas.microsoft.com/office/word/2010/wordprocessingGroup" xmlns:wpi="http://schemas.microsoft.com/office/word/2010/wordprocessingInk" xmlns:wne="http://schemas.microsoft.com/office/word/2006/wordml" xmlns:wps="http://schemas.microsoft.com/office/word/2010/wordprocessingShape" mc:Ignorable="w14 w15 w16se w16cid w16 w16cex w16sdtdh w16sdtfl w16du wp14">
   <w:abstractNum w:abstractNumId="0" w15:restartNumberingAfterBreak="0">
     <w:nsid w:val="12946ABD"/>
     <w:multiLevelType w:val="multilevel"/>

</xml_diff>

<commit_message>
Match LaTeX template header to the official Word template
Rebuilds the title-page letterhead to match the Word template: the
full QIRT Asia 2027 logo lockup on the left, and the illustrated
Singapore skyline banner (Merlion, Marina Bay Sands, Gardens by the
Bay, ArtScience Museum, Ferris wheel) with the conference name in
italic underneath, on the right - separated from the title by a rule.

Moved this out of the fancyhdr running header (where the full lockup
logo was rendering illegibly small at a fixed 1.6cm height) and into
the \maketitle body instead, since the letterhead only needs to
appear once on the title page; the running header on later pages is
unaffected. Compressed the logo and banner images for a reasonable
package size (4MB+1MB source images -> ~1MB each) and dropped the
now-unused wordmark crop.

Also updates the packaged QIRTAsia2027_LaTeX_Template.zip and the
Word .docx template (already carrying the same new header) to match.
</commit_message>
<xml_diff>
--- a/downloads/QIRTAsia2027_ExtendedAbstract_Template.docx
+++ b/downloads/QIRTAsia2027_ExtendedAbstract_Template.docx
@@ -323,10 +323,10 @@
           <w:noProof/>
         </w:rPr>
         <w:object w:dxaOrig="177" w:dyaOrig="340" w14:anchorId="7BC7C768">
-          <v:shape id="ole_rId2" o:spid="_x0000_i1025" type="#_x0000_t75" alt="" style="width:8.15pt;height:16.9pt;visibility:visible;mso-width-percent:0;mso-height-percent:0;mso-wrap-distance-right:0;mso-width-percent:0;mso-height-percent:0" o:ole="" filled="t">
+          <v:shape id="ole_rId2" o:spid="_x0000_i1025" type="#_x0000_t75" alt="" style="width:8.05pt;height:16.7pt;visibility:visible;mso-width-percent:0;mso-height-percent:0;mso-wrap-distance-right:0;mso-width-percent:0;mso-height-percent:0" o:ole="" filled="t">
             <v:imagedata r:id="rId8" o:title=""/>
           </v:shape>
-          <o:OLEObject Type="Embed" ProgID="Equation.3" ShapeID="ole_rId2" DrawAspect="Content" ObjectID="_1847253747" r:id="rId9"/>
+          <o:OLEObject Type="Embed" ProgID="Equation.3" ShapeID="ole_rId2" DrawAspect="Content" ObjectID="_1847435993" r:id="rId9"/>
         </w:object>
       </w:r>
       <w:r>
@@ -341,10 +341,10 @@
           <w:noProof/>
         </w:rPr>
         <w:object w:dxaOrig="1535" w:dyaOrig="543" w14:anchorId="523785A6">
-          <v:shape id="ole_rId4" o:spid="_x0000_i1026" type="#_x0000_t75" alt="" style="width:76.4pt;height:25.65pt;visibility:visible;mso-width-percent:0;mso-height-percent:0;mso-wrap-distance-right:0;mso-width-percent:0;mso-height-percent:0" o:ole="" filled="t">
+          <v:shape id="ole_rId4" o:spid="_x0000_i1026" type="#_x0000_t75" alt="" style="width:76.6pt;height:25.9pt;visibility:visible;mso-width-percent:0;mso-height-percent:0;mso-wrap-distance-right:0;mso-width-percent:0;mso-height-percent:0" o:ole="" filled="t">
             <v:imagedata r:id="rId10" o:title=""/>
           </v:shape>
-          <o:OLEObject Type="Embed" ProgID="Equation.3" ShapeID="ole_rId4" DrawAspect="Content" ObjectID="_1847253748" r:id="rId11"/>
+          <o:OLEObject Type="Embed" ProgID="Equation.3" ShapeID="ole_rId4" DrawAspect="Content" ObjectID="_1847435994" r:id="rId11"/>
         </w:object>
       </w:r>
       <w:r>
@@ -1261,10 +1261,10 @@
         <w:lang w:val="en-US"/>
       </w:rPr>
       <w:drawing>
-        <wp:inline distT="0" distB="0" distL="0" distR="0" wp14:anchorId="35FCF9BA" wp14:editId="4505226C">
-          <wp:extent cx="5416828" cy="749339"/>
-          <wp:effectExtent l="0" t="0" r="0" b="0"/>
-          <wp:docPr id="1315149021" name="Picture 1"/>
+        <wp:inline distT="0" distB="0" distL="0" distR="0" wp14:anchorId="2AEA8F5D" wp14:editId="038AA985">
+          <wp:extent cx="5396443" cy="855878"/>
+          <wp:effectExtent l="0" t="0" r="0" b="1905"/>
+          <wp:docPr id="1838339315" name="Picture 2"/>
           <wp:cNvGraphicFramePr>
             <a:graphicFrameLocks xmlns:a="http://schemas.openxmlformats.org/drawingml/2006/main" noChangeAspect="1"/>
           </wp:cNvGraphicFramePr>
@@ -1272,23 +1272,41 @@
             <a:graphicData uri="http://schemas.openxmlformats.org/drawingml/2006/picture">
               <pic:pic xmlns:pic="http://schemas.openxmlformats.org/drawingml/2006/picture">
                 <pic:nvPicPr>
-                  <pic:cNvPr id="2083801934" name=""/>
-                  <pic:cNvPicPr/>
+                  <pic:cNvPr id="0" name="Picture 1"/>
+                  <pic:cNvPicPr>
+                    <a:picLocks noChangeAspect="1" noChangeArrowheads="1"/>
+                  </pic:cNvPicPr>
                 </pic:nvPicPr>
-                <pic:blipFill>
-                  <a:blip r:embed="rId1"/>
+                <pic:blipFill rotWithShape="1">
+                  <a:blip r:embed="rId1">
+                    <a:extLst>
+                      <a:ext uri="{28A0092B-C50C-407E-A947-70E740481C1C}">
+                        <a14:useLocalDpi xmlns:a14="http://schemas.microsoft.com/office/drawing/2010/main" val="0"/>
+                      </a:ext>
+                    </a:extLst>
+                  </a:blip>
+                  <a:srcRect t="34552" b="17868"/>
                   <a:stretch>
                     <a:fillRect/>
                   </a:stretch>
                 </pic:blipFill>
-                <pic:spPr>
+                <pic:spPr bwMode="auto">
                   <a:xfrm>
                     <a:off x="0" y="0"/>
-                    <a:ext cx="5416828" cy="749339"/>
+                    <a:ext cx="5400000" cy="856442"/>
                   </a:xfrm>
                   <a:prstGeom prst="rect">
                     <a:avLst/>
                   </a:prstGeom>
+                  <a:noFill/>
+                  <a:ln>
+                    <a:noFill/>
+                  </a:ln>
+                  <a:extLst>
+                    <a:ext uri="{53640926-AAD7-44D8-BBD7-CCE9431645EC}">
+                      <a14:shadowObscured xmlns:a14="http://schemas.microsoft.com/office/drawing/2010/main"/>
+                    </a:ext>
+                  </a:extLst>
                 </pic:spPr>
               </pic:pic>
             </a:graphicData>
@@ -1630,10 +1648,10 @@
               <w:lang w:val="en-US"/>
             </w:rPr>
             <w:drawing>
-              <wp:inline distT="0" distB="0" distL="0" distR="0" wp14:anchorId="51C43CA7" wp14:editId="7057A16A">
-                <wp:extent cx="5416828" cy="749339"/>
-                <wp:effectExtent l="0" t="0" r="0" b="0"/>
-                <wp:docPr id="2083801934" name="Picture 1"/>
+              <wp:inline distT="0" distB="0" distL="0" distR="0" wp14:anchorId="1F5A3676" wp14:editId="3485BAD0">
+                <wp:extent cx="5396443" cy="855878"/>
+                <wp:effectExtent l="0" t="0" r="0" b="1905"/>
+                <wp:docPr id="1527750616" name="Picture 2"/>
                 <wp:cNvGraphicFramePr>
                   <a:graphicFrameLocks xmlns:a="http://schemas.openxmlformats.org/drawingml/2006/main" noChangeAspect="1"/>
                 </wp:cNvGraphicFramePr>
@@ -1641,23 +1659,41 @@
                   <a:graphicData uri="http://schemas.openxmlformats.org/drawingml/2006/picture">
                     <pic:pic xmlns:pic="http://schemas.openxmlformats.org/drawingml/2006/picture">
                       <pic:nvPicPr>
-                        <pic:cNvPr id="2083801934" name=""/>
-                        <pic:cNvPicPr/>
+                        <pic:cNvPr id="0" name="Picture 1"/>
+                        <pic:cNvPicPr>
+                          <a:picLocks noChangeAspect="1" noChangeArrowheads="1"/>
+                        </pic:cNvPicPr>
                       </pic:nvPicPr>
-                      <pic:blipFill>
-                        <a:blip r:embed="rId2"/>
+                      <pic:blipFill rotWithShape="1">
+                        <a:blip r:embed="rId2">
+                          <a:extLst>
+                            <a:ext uri="{28A0092B-C50C-407E-A947-70E740481C1C}">
+                              <a14:useLocalDpi xmlns:a14="http://schemas.microsoft.com/office/drawing/2010/main" val="0"/>
+                            </a:ext>
+                          </a:extLst>
+                        </a:blip>
+                        <a:srcRect t="34552" b="17868"/>
                         <a:stretch>
                           <a:fillRect/>
                         </a:stretch>
                       </pic:blipFill>
-                      <pic:spPr>
+                      <pic:spPr bwMode="auto">
                         <a:xfrm>
                           <a:off x="0" y="0"/>
-                          <a:ext cx="5416828" cy="749339"/>
+                          <a:ext cx="5400000" cy="856442"/>
                         </a:xfrm>
                         <a:prstGeom prst="rect">
                           <a:avLst/>
                         </a:prstGeom>
+                        <a:noFill/>
+                        <a:ln>
+                          <a:noFill/>
+                        </a:ln>
+                        <a:extLst>
+                          <a:ext uri="{53640926-AAD7-44D8-BBD7-CCE9431645EC}">
+                            <a14:shadowObscured xmlns:a14="http://schemas.microsoft.com/office/drawing/2010/main"/>
+                          </a:ext>
+                        </a:extLst>
                       </pic:spPr>
                     </pic:pic>
                   </a:graphicData>

</xml_diff>